<commit_message>
ci: gate Azure deploy on AZURE_ENABLED var; docs: OIDC secret setup + .env config
- deploy.yml: build-deploy-promote now runs only when repo var AZURE_ENABLED=='true'
  (job-level `if:` can't read secrets). Until then the pipeline is green — eval
  gate runs, deploy is skipped — instead of red on missing Azure OIDC secrets.
- Lab10_Azure_Setup_Steps.docx §6.2: exact steps for where to set
  AZURE_CLIENT_ID / AZURE_TENANT_ID / AZURE_SUBSCRIPTION_ID (Settings ▸ Secrets and
  variables ▸ Actions, UI + gh CLI) and the AZURE_ENABLED variable.
- Bundles the earlier .env config work: 00_env.sh loads repo-root .env (values
  override built-in defaults), .env.example template, 01_acr_build_push.sh uses the
  existing RG (verify, no create), and README/docx point learners to copy .env.example.

Co-Authored-By: Claude Opus 4.8 <noreply@anthropic.com>
</commit_message>
<xml_diff>
--- a/Lab10_Azure_Setup_Steps.docx
+++ b/Lab10_Azure_Setup_Steps.docx
@@ -1924,7 +1924,35 @@
         <w:pStyle w:val="Heading2"/>
       </w:pPr>
       <w:r>
-        <w:t xml:space="preserve">3.1 Names to reuse (edit deploy/00_env.sh)</w:t>
+        <w:t>3.1 Set your values in .env (copy .env.example — don’t edit 00_env.sh)</w:t>
+      </w:r>
+    </w:p>
+    <w:p>
+      <w:r>
+        <w:t>Set per-learner values in a .env file — do not edit deploy/00_env.sh. Copy the template and edit it; .env is git-ignored, so your resource-group name and other values stay out of the repo. deploy/00_env.sh loads .env automatically and falls back to its built-in defaults for anything you leave unset.</w:t>
+      </w:r>
+    </w:p>
+    <w:p>
+      <w:r>
+        <w:rPr>
+          <w:rFonts w:ascii="Consolas" w:hAnsi="Consolas" w:cs="Consolas"/>
+          <w:sz w:val="18"/>
+        </w:rPr>
+        <w:t>cp .env.example .env</w:t>
+      </w:r>
+    </w:p>
+    <w:p>
+      <w:r>
+        <w:rPr>
+          <w:rFonts w:ascii="Consolas" w:hAnsi="Consolas" w:cs="Consolas"/>
+          <w:sz w:val="18"/>
+        </w:rPr>
+        <w:t>$EDITOR .env        # or: code .env / nano .env</w:t>
+      </w:r>
+    </w:p>
+    <w:p>
+      <w:r>
+        <w:t>At a minimum set RG to the EXISTING resource group already created under your learner account (the labs do not create it — list yours with:  az group list -o table), and ACR to a globally-unique lowercase registry name. The remaining keys — LOCATION, ACA_ENV, APP, IMAGE_REPO, APP_INSIGHTS — can keep their defaults. The table below explains each name.</w:t>
       </w:r>
     </w:p>
     <w:tbl>
@@ -4113,6 +4141,143 @@
     <w:p>
       <w:r>
         <w:br w:type="page"/>
+      </w:r>
+    </w:p>
+    <w:p>
+      <w:r>
+        <w:rPr>
+          <w:b/>
+        </w:rPr>
+        <w:t>Where to set the three secrets + the deploy toggle</w:t>
+      </w:r>
+    </w:p>
+    <w:p>
+      <w:r>
+        <w:t>On GitHub, open the repo ▸ Settings ▸ Secrets and variables ▸ Actions. This page has two tabs: Secrets and Variables.</w:t>
+      </w:r>
+    </w:p>
+    <w:p>
+      <w:r>
+        <w:t>1) Secrets tab ▸ New repository secret — add these three (names must match exactly):</w:t>
+      </w:r>
+    </w:p>
+    <w:p>
+      <w:r>
+        <w:rPr>
+          <w:rFonts w:ascii="Consolas" w:hAnsi="Consolas" w:cs="Consolas"/>
+          <w:sz w:val="18"/>
+        </w:rPr>
+        <w:t>AZURE_CLIENT_ID         # the app registration's Application (client) ID</w:t>
+      </w:r>
+    </w:p>
+    <w:p>
+      <w:r>
+        <w:rPr>
+          <w:rFonts w:ascii="Consolas" w:hAnsi="Consolas" w:cs="Consolas"/>
+          <w:sz w:val="18"/>
+        </w:rPr>
+        <w:t>AZURE_TENANT_ID         # your Entra (Azure AD) tenant ID</w:t>
+      </w:r>
+    </w:p>
+    <w:p>
+      <w:r>
+        <w:rPr>
+          <w:rFonts w:ascii="Consolas" w:hAnsi="Consolas" w:cs="Consolas"/>
+          <w:sz w:val="18"/>
+        </w:rPr>
+        <w:t>AZURE_SUBSCRIPTION_ID   # the subscription that holds the resource group</w:t>
+      </w:r>
+    </w:p>
+    <w:p>
+      <w:r>
+        <w:t>Find the values (from the app registration created above):</w:t>
+      </w:r>
+    </w:p>
+    <w:p>
+      <w:r>
+        <w:rPr>
+          <w:rFonts w:ascii="Consolas" w:hAnsi="Consolas" w:cs="Consolas"/>
+          <w:sz w:val="18"/>
+        </w:rPr>
+        <w:t>az account show --query '{tenant:tenantId, subscription:id}' -o table</w:t>
+      </w:r>
+    </w:p>
+    <w:p>
+      <w:r>
+        <w:rPr>
+          <w:rFonts w:ascii="Consolas" w:hAnsi="Consolas" w:cs="Consolas"/>
+          <w:sz w:val="18"/>
+        </w:rPr>
+        <w:t>az ad app list --display-name lab10-gha --query '[0].appId' -o tsv   # AZURE_CLIENT_ID</w:t>
+      </w:r>
+    </w:p>
+    <w:p>
+      <w:r>
+        <w:t>Prefer the CLI? Run these inside the cloned repo (gh targets the current repo):</w:t>
+      </w:r>
+    </w:p>
+    <w:p>
+      <w:r>
+        <w:rPr>
+          <w:rFonts w:ascii="Consolas" w:hAnsi="Consolas" w:cs="Consolas"/>
+          <w:sz w:val="18"/>
+        </w:rPr>
+        <w:t>gh secret set AZURE_CLIENT_ID</w:t>
+      </w:r>
+    </w:p>
+    <w:p>
+      <w:r>
+        <w:rPr>
+          <w:rFonts w:ascii="Consolas" w:hAnsi="Consolas" w:cs="Consolas"/>
+          <w:sz w:val="18"/>
+        </w:rPr>
+        <w:t>gh secret set AZURE_TENANT_ID</w:t>
+      </w:r>
+    </w:p>
+    <w:p>
+      <w:r>
+        <w:rPr>
+          <w:rFonts w:ascii="Consolas" w:hAnsi="Consolas" w:cs="Consolas"/>
+          <w:sz w:val="18"/>
+        </w:rPr>
+        <w:t>gh secret set AZURE_SUBSCRIPTION_ID</w:t>
+      </w:r>
+    </w:p>
+    <w:p>
+      <w:r>
+        <w:rPr>
+          <w:rFonts w:ascii="Consolas" w:hAnsi="Consolas" w:cs="Consolas"/>
+          <w:sz w:val="18"/>
+        </w:rPr>
+        <w:t>#   or non-interactively:  gh secret set AZURE_CLIENT_ID --body "&lt;value&gt;"</w:t>
+      </w:r>
+    </w:p>
+    <w:p>
+      <w:r>
+        <w:t>2) Variables tab ▸ New repository variable — turn the deploy job ON. The build-deploy job is gated on this because a job-level if: condition cannot read secrets, only variables:</w:t>
+      </w:r>
+    </w:p>
+    <w:p>
+      <w:r>
+        <w:rPr>
+          <w:rFonts w:ascii="Consolas" w:hAnsi="Consolas" w:cs="Consolas"/>
+          <w:sz w:val="18"/>
+        </w:rPr>
+        <w:t>AZURE_ENABLED = true</w:t>
+      </w:r>
+    </w:p>
+    <w:p>
+      <w:r>
+        <w:rPr>
+          <w:rFonts w:ascii="Consolas" w:hAnsi="Consolas" w:cs="Consolas"/>
+          <w:sz w:val="18"/>
+        </w:rPr>
+        <w:t>#   CLI equivalent:  gh variable set AZURE_ENABLED --body true</w:t>
+      </w:r>
+    </w:p>
+    <w:p>
+      <w:r>
+        <w:t>Until AZURE_ENABLED is 'true', the pipeline stays green: eval-precheck runs and build-deploy-promote is skipped. Set it to true only after the three secrets exist and the resource group / ACR are in place.</w:t>
       </w:r>
     </w:p>
     <w:p>

</xml_diff>